<commit_message>
fix(contratos): rastreador genérico no comodato (remove marca Autotrac)
- Anexo III e Cláusula Quarta: 'Autotrac' -> 'Rastreador' (equipamento pode ser de outra marca)
- Marca/Modelo do comodato vira 'Rastreador' genérico; operador preenche só o nº de série/ID
- Labels do formulário e mensagens de pendência ajustadas

Co-Authored-By: Claude Opus 4.8 <noreply@anthropic.com>
</commit_message>
<xml_diff>
--- a/contrato_tac_template.docx
+++ b/contrato_tac_template.docx
@@ -5412,15 +5412,14 @@
           <w:sz w:val="22"/>
           <w:szCs w:val="22"/>
         </w:rPr>
-        <w:t xml:space="preserve"> </w:t>
-      </w:r>
-      <w:r>
-        <w:rPr>
-          <w:rFonts w:ascii="Cambria" w:hAnsi="Cambria"/>
-          <w:sz w:val="22"/>
-          <w:szCs w:val="22"/>
-        </w:rPr>
-        <w:t xml:space="preserve">A CONTRATANTE cederá ao CONTRATADO um Rastreador </w:t>
+        <w:t xml:space="preserve"> A CONTRATANTE cederá ao CONTRATADO um Rastreador em regime de                          COMODATO, cujo detalhamento de série, estado de conservação e instalação será formalizado mediante a assinatura de um 'Termo de Comodato de Equipamento' em anexo, que passa a integrar este instrumento. Na hipótese de rescisão deste contrato, o CONTRATADO obriga-se a devolver o equipamento em perfeito estado. Caso não seja devolvido no prazo de 05 (cinco) dias, o CONTRATADO autoriza, desde já, o desconto ou a cobrança do valor de R$ 8.500,00 (oito mil e quinhentos reais) a título de indenização pelo equipamento.</w:t>
+      </w:r>
+      <w:r>
+        <w:rPr>
+          <w:rFonts w:ascii="Cambria" w:hAnsi="Cambria"/>
+          <w:sz w:val="22"/>
+          <w:szCs w:val="22"/>
+        </w:rPr>
       </w:r>
       <w:proofErr w:type="spellStart"/>
       <w:r>
@@ -5429,7 +5428,6 @@
           <w:sz w:val="22"/>
           <w:szCs w:val="22"/>
         </w:rPr>
-        <w:t>Autotrac</w:t>
       </w:r>
       <w:proofErr w:type="spellEnd"/>
       <w:r>
@@ -5438,7 +5436,6 @@
           <w:sz w:val="22"/>
           <w:szCs w:val="22"/>
         </w:rPr>
-        <w:t xml:space="preserve"> em regime de                          COMODATO, cujo detalhamento de série, estado de conservação e instalação será formalizado mediante a assinatura de um 'Termo de Comodato de Equipamento' em anexo, que passa a integrar este instrumento. Na hipótese de rescisão deste contrato, o CONTRATADO obriga-se a devolver o equipamento em perfeito estado. Caso não seja devolvido no prazo de 05 (cinco) dias, o CONTRATADO autoriza, desde já, o desconto ou a cobrança do valor de R$ 8.500,00 (oito mil e quinhentos reais) a título de indenização pelo equipamento.</w:t>
       </w:r>
     </w:p>
     <w:p>

</xml_diff>

<commit_message>
feat(contratos): campo Marca/Modelo do rastreador no comodato
- Anexo III: Marca/Modelo agora é preenchível (junto com o nº de série/ID)
- Ambos obrigatórios quando o equipamento é da Rizza (Comodato)
- Reverte a Cláusula Quarta ao texto original — mudança fica só no Anexo

Co-Authored-By: Claude Opus 4.8 <noreply@anthropic.com>
</commit_message>
<xml_diff>
--- a/contrato_tac_template.docx
+++ b/contrato_tac_template.docx
@@ -5412,14 +5412,15 @@
           <w:sz w:val="22"/>
           <w:szCs w:val="22"/>
         </w:rPr>
-        <w:t xml:space="preserve"> A CONTRATANTE cederá ao CONTRATADO um Rastreador em regime de                          COMODATO, cujo detalhamento de série, estado de conservação e instalação será formalizado mediante a assinatura de um 'Termo de Comodato de Equipamento' em anexo, que passa a integrar este instrumento. Na hipótese de rescisão deste contrato, o CONTRATADO obriga-se a devolver o equipamento em perfeito estado. Caso não seja devolvido no prazo de 05 (cinco) dias, o CONTRATADO autoriza, desde já, o desconto ou a cobrança do valor de R$ 8.500,00 (oito mil e quinhentos reais) a título de indenização pelo equipamento.</w:t>
-      </w:r>
-      <w:r>
-        <w:rPr>
-          <w:rFonts w:ascii="Cambria" w:hAnsi="Cambria"/>
-          <w:sz w:val="22"/>
-          <w:szCs w:val="22"/>
-        </w:rPr>
+        <w:t xml:space="preserve"> </w:t>
+      </w:r>
+      <w:r>
+        <w:rPr>
+          <w:rFonts w:ascii="Cambria" w:hAnsi="Cambria"/>
+          <w:sz w:val="22"/>
+          <w:szCs w:val="22"/>
+        </w:rPr>
+        <w:t xml:space="preserve">A CONTRATANTE cederá ao CONTRATADO um Rastreador </w:t>
       </w:r>
       <w:proofErr w:type="spellStart"/>
       <w:r>
@@ -5428,6 +5429,7 @@
           <w:sz w:val="22"/>
           <w:szCs w:val="22"/>
         </w:rPr>
+        <w:t>Autotrac</w:t>
       </w:r>
       <w:proofErr w:type="spellEnd"/>
       <w:r>
@@ -5436,6 +5438,7 @@
           <w:sz w:val="22"/>
           <w:szCs w:val="22"/>
         </w:rPr>
+        <w:t xml:space="preserve"> em regime de                          COMODATO, cujo detalhamento de série, estado de conservação e instalação será formalizado mediante a assinatura de um 'Termo de Comodato de Equipamento' em anexo, que passa a integrar este instrumento. Na hipótese de rescisão deste contrato, o CONTRATADO obriga-se a devolver o equipamento em perfeito estado. Caso não seja devolvido no prazo de 05 (cinco) dias, o CONTRATADO autoriza, desde já, o desconto ou a cobrança do valor de R$ 8.500,00 (oito mil e quinhentos reais) a título de indenização pelo equipamento.</w:t>
       </w:r>
     </w:p>
     <w:p>

</xml_diff>